<commit_message>
WP09: internacjonalizacja i patent (K3-23, K3-24, K3-59..66, K14-01), rejestr D40-D41, N68-N71, T30-T32; 6.1 Hajduk Z10
Co-Authored-By: Claude Sonnet 5.5 <noreply@anthropic.com>
Claude-Session: https://claude.ai/code/session_01672WnJhixnEcarbb7uiwfx
</commit_message>
<xml_diff>
--- a/Sekcja_6.1_zespol_projektowy.docx
+++ b/Sekcja_6.1_zespol_projektowy.docx
@@ -1368,7 +1368,7 @@
           <w:color w:val="666666"/>
           <w:sz w:val="17"/>
         </w:rPr>
-        <w:t xml:space="preserve"> [361 znaków]</w:t>
+        <w:t xml:space="preserve"> [430 znaków]</w:t>
       </w:r>
     </w:p>
     <w:p>
@@ -1379,7 +1379,7 @@
         <w:rPr>
           <w:b w:val="0"/>
         </w:rPr>
-        <w:t>Specjalista ds. logistyki TSL: w Z2 prowadzi inspekcje stanu ładunku (ground truth) w trybie ślepym, przekazuje wymagania domenowe do protokołu zbioru i zatwierdza etykietę przy rozbieżnościach anotatorów; w Z6 i Z7 definiuje scenariusze operacyjne i ocenia trafność alertów; w Z9 prowadzi inspekcje, weryfikuje próbkę obrazów i badanie akceptacji z kierowcami.</w:t>
+        <w:t>Specjalista ds. logistyki TSL: w Z2 prowadzi inspekcje stanu ładunku (ground truth) w trybie ślepym, przekazuje wymagania domenowe do protokołu zbioru i zatwierdza etykietę przy rozbieżnościach anotatorów; w Z6 i Z7 definiuje scenariusze operacyjne i ocenia trafność alertów; w Z9 prowadzi inspekcje, weryfikuje próbkę obrazów i badanie akceptacji z kierowcami; w Z10 reprezentuje Lidera w spotkaniach z partnerami w regionie CEE.</w:t>
       </w:r>
     </w:p>
     <w:p>
@@ -1399,7 +1399,7 @@
           <w:color w:val="666666"/>
           <w:sz w:val="17"/>
         </w:rPr>
-        <w:t xml:space="preserve"> [54 znaków]</w:t>
+        <w:t xml:space="preserve"> [59 znaków]</w:t>
       </w:r>
     </w:p>
     <w:p>
@@ -1410,7 +1410,7 @@
         <w:rPr>
           <w:b w:val="0"/>
         </w:rPr>
-        <w:t>Z2, Z6, Z7, Z9; 0,5 etatu (84 h/mc); 30 mies. (M1-M30)</w:t>
+        <w:t>Z2, Z6, Z7, Z9, Z10; 0,5 etatu (84 h/mc); 30 mies. (M1-M30)</w:t>
       </w:r>
     </w:p>
     <w:p>

</xml_diff>